<commit_message>
Article: Appendix A — reconcile with author answers (casebook = professor's own files not a casebook source; TA review-session materials are included teaching aids, not excluded student work); rebuild 03-Appendices.docx
</commit_message>
<xml_diff>
--- a/Chandler Constitutional Law Vault/Article/packet-2026-05-30/03-Appendices.docx
+++ b/Chandler Constitutional Law Vault/Article/packet-2026-05-30/03-Appendices.docx
@@ -600,7 +600,7 @@
         </w:numPr>
       </w:pPr>
       <w:r>
-        <w:t xml:space="preserve">Copyrighted casebook excerpts (per the professor’s IP review).</w:t>
+        <w:t xml:space="preserve">Copyrighted casebook excerpts. The corpus is drawn from Professor Chandler’s own course materials; casebook text was not a source (the author’s understanding, pending the professor’s confirmation). Ten assigned opinions accordingly have vault briefs but no source PDF on disk (see below).</w:t>
       </w:r>
     </w:p>
     <w:p>
@@ -612,7 +612,23 @@
         </w:numPr>
       </w:pPr>
       <w:r>
-        <w:t xml:space="preserve">Student work product (privacy).</w:t>
+        <w:t xml:space="preserve">Student work product — graded submissions and exam answers (privacy/IRB). One boundary case: review-session materials prepared by teaching assistants</w:t>
+      </w:r>
+      <w:r>
+        <w:t xml:space="preserve"> </w:t>
+      </w:r>
+      <w:r>
+        <w:rPr>
+          <w:i/>
+          <w:iCs/>
+        </w:rPr>
+        <w:t xml:space="preserve">are</w:t>
+      </w:r>
+      <w:r>
+        <w:t xml:space="preserve"> </w:t>
+      </w:r>
+      <w:r>
+        <w:t xml:space="preserve">part of the ingested corpus, but they are TA-authored teaching aids, not student submissions, so they raise an authorship-attribution note rather than a student-privacy concern.</w:t>
       </w:r>
     </w:p>
     <w:p>

</xml_diff>